<commit_message>
docs: update database design document with table relationships
Co-Authored-By: Claude Opus 4.7 <noreply@anthropic.com>
</commit_message>
<xml_diff>
--- a/数据库设计文档.docx
+++ b/数据库设计文档.docx
@@ -377,7 +377,6 @@
                 <w:szCs w:val="21"/>
               </w:rPr>
             </w:pPr>
-            <w:bookmarkStart w:id="0" w:name="_GoBack" w:colFirst="0" w:colLast="1"/>
             <w:r>
               <w:rPr>
                 <w:rFonts w:hint="default" w:ascii="Times New Roman" w:hAnsi="Times New Roman" w:cs="Times New Roman"/>
@@ -420,7 +419,6 @@
           </w:p>
         </w:tc>
       </w:tr>
-      <w:bookmarkEnd w:id="0"/>
       <w:tr>
         <w:tblPrEx>
           <w:tblBorders>
@@ -18618,12 +18616,6 @@
             <w:insideH w:val="single" w:color="4874CB" w:themeColor="accent1" w:sz="8" w:space="0"/>
             <w:insideV w:val="single" w:color="4874CB" w:themeColor="accent1" w:sz="8" w:space="0"/>
           </w:tblBorders>
-          <w:tblCellMar>
-            <w:top w:w="0" w:type="dxa"/>
-            <w:left w:w="108" w:type="dxa"/>
-            <w:bottom w:w="0" w:type="dxa"/>
-            <w:right w:w="108" w:type="dxa"/>
-          </w:tblCellMar>
         </w:tblPrEx>
         <w:trPr>
           <w:jc w:val="center"/>
@@ -20841,9 +20833,9 @@
         </w:rPr>
         <w:drawing>
           <wp:inline distT="0" distB="0" distL="114300" distR="114300">
-            <wp:extent cx="5210810" cy="4909185"/>
-            <wp:effectExtent l="0" t="0" r="1270" b="13335"/>
-            <wp:docPr id="11" name="图片 11" descr="整体图.drawio"/>
+            <wp:extent cx="5271770" cy="3632835"/>
+            <wp:effectExtent l="0" t="0" r="0" b="0"/>
+            <wp:docPr id="1" name="图片 1" descr="未命名文件 (1)"/>
             <wp:cNvGraphicFramePr>
               <a:graphicFrameLocks xmlns:a="http://schemas.openxmlformats.org/drawingml/2006/main" noChangeAspect="1"/>
             </wp:cNvGraphicFramePr>
@@ -20851,13 +20843,19 @@
               <a:graphicData uri="http://schemas.openxmlformats.org/drawingml/2006/picture">
                 <pic:pic xmlns:pic="http://schemas.openxmlformats.org/drawingml/2006/picture">
                   <pic:nvPicPr>
-                    <pic:cNvPr id="11" name="图片 11" descr="整体图.drawio"/>
+                    <pic:cNvPr id="1" name="图片 1" descr="未命名文件 (1)"/>
                     <pic:cNvPicPr>
                       <a:picLocks noChangeAspect="1"/>
                     </pic:cNvPicPr>
                   </pic:nvPicPr>
                   <pic:blipFill>
-                    <a:blip r:embed="rId20"/>
+                    <a:blip r:embed="rId20">
+                      <a:extLst>
+                        <a:ext uri="{96DAC541-7B7A-43D3-8B79-37D633B846F1}">
+                          <asvg:svgBlip xmlns:asvg="http://schemas.microsoft.com/office/drawing/2016/SVG/main" r:embed="rId21"/>
+                        </a:ext>
+                      </a:extLst>
+                    </a:blip>
                     <a:stretch>
                       <a:fillRect/>
                     </a:stretch>
@@ -20865,7 +20863,7 @@
                   <pic:spPr>
                     <a:xfrm>
                       <a:off x="0" y="0"/>
-                      <a:ext cx="5210810" cy="4909185"/>
+                      <a:ext cx="5271770" cy="3632835"/>
                     </a:xfrm>
                     <a:prstGeom prst="rect">
                       <a:avLst/>
@@ -20877,6 +20875,8 @@
           </wp:inline>
         </w:drawing>
       </w:r>
+      <w:bookmarkStart w:id="0" w:name="_GoBack"/>
+      <w:bookmarkEnd w:id="0"/>
     </w:p>
     <w:p>
       <w:pPr>
@@ -21750,6 +21750,7 @@
     <w:p>
       <w:pPr>
         <w:numPr>
+          <w:ilvl w:val="0"/>
           <w:numId w:val="0"/>
         </w:numPr>
         <w:bidi w:val="0"/>
@@ -21960,6 +21961,7 @@
     <w:p>
       <w:pPr>
         <w:numPr>
+          <w:ilvl w:val="0"/>
           <w:numId w:val="0"/>
         </w:numPr>
         <w:bidi w:val="0"/>
@@ -22171,6 +22173,7 @@
     <w:p>
       <w:pPr>
         <w:numPr>
+          <w:ilvl w:val="0"/>
           <w:numId w:val="0"/>
         </w:numPr>
         <w:bidi w:val="0"/>
@@ -22465,6 +22468,7 @@
     <w:p>
       <w:pPr>
         <w:numPr>
+          <w:ilvl w:val="0"/>
           <w:numId w:val="0"/>
         </w:numPr>
         <w:bidi w:val="0"/>
@@ -22743,6 +22747,7 @@
     <w:p>
       <w:pPr>
         <w:numPr>
+          <w:ilvl w:val="0"/>
           <w:numId w:val="0"/>
         </w:numPr>
         <w:bidi w:val="0"/>
@@ -23069,6 +23074,7 @@
     <w:p>
       <w:pPr>
         <w:numPr>
+          <w:ilvl w:val="0"/>
           <w:numId w:val="0"/>
         </w:numPr>
         <w:bidi w:val="0"/>
@@ -23582,6 +23588,7 @@
     <w:p>
       <w:pPr>
         <w:numPr>
+          <w:ilvl w:val="0"/>
           <w:numId w:val="0"/>
         </w:numPr>
         <w:bidi w:val="0"/>
@@ -23777,6 +23784,7 @@
     <w:p>
       <w:pPr>
         <w:numPr>
+          <w:ilvl w:val="0"/>
           <w:numId w:val="0"/>
         </w:numPr>
         <w:bidi w:val="0"/>
@@ -24118,6 +24126,7 @@
     <w:p>
       <w:pPr>
         <w:numPr>
+          <w:ilvl w:val="0"/>
           <w:numId w:val="0"/>
         </w:numPr>
         <w:bidi w:val="0"/>
@@ -24331,6 +24340,7 @@
     <w:p>
       <w:pPr>
         <w:numPr>
+          <w:ilvl w:val="0"/>
           <w:numId w:val="0"/>
         </w:numPr>
         <w:bidi w:val="0"/>
@@ -24496,6 +24506,7 @@
     <w:p>
       <w:pPr>
         <w:numPr>
+          <w:ilvl w:val="0"/>
           <w:numId w:val="0"/>
         </w:numPr>
         <w:bidi w:val="0"/>
@@ -24512,6 +24523,7 @@
     <w:p>
       <w:pPr>
         <w:numPr>
+          <w:ilvl w:val="0"/>
           <w:numId w:val="0"/>
         </w:numPr>
         <w:bidi w:val="0"/>

</xml_diff>